<commit_message>
feat: grouping file type, command dummy & purge orphan, path storage by created_at
Grouping file type dokumen:
- tabel group_file_types + kolom group_file_type_id di file_types
- model GroupFileType, relasi FileType::group(), seeder pemetaan grup
- tampilan detail pengajuan dikelompokkan per grup dokumen

File management & storage:
- setPathStorage pakai created_at application (bukan tanggal sekarang)
- FileManagementService::purgeOrphanFiles + command files:purge-orphans
  untuk membersihkan record files yatim (batch via chunkById)
- guard null di updateApplicationFilesReport + extract findApplicationFileByCode

Data dummy:
- command dummy:draft-detail --app_id lewat DummyDraftDetailSeeder
- bisnis logic MasterManagementService::seedDummyDraftDetail (5 tabel)

Rundown: institution kosong difallback ke string "null" saat formatting
</commit_message>
<xml_diff>
--- a/public/templates/sk.docx
+++ b/public/templates/sk.docx
@@ -4784,7 +4784,25 @@
                 <w:sz w:val="20"/>
                 <w:szCs w:val="20"/>
               </w:rPr>
-              <w:t xml:space="preserve"> Dinas Dalam Negeri </w:t>
+              <w:t xml:space="preserve"> Dinas </w:t>
+            </w:r>
+            <w:proofErr w:type="spellStart"/>
+            <w:r>
+              <w:rPr>
+                <w:rFonts w:ascii="Arial Narrow" w:hAnsi="Arial Narrow"/>
+                <w:sz w:val="20"/>
+                <w:szCs w:val="20"/>
+              </w:rPr>
+              <w:t>Dalam</w:t>
+            </w:r>
+            <w:proofErr w:type="spellEnd"/>
+            <w:r>
+              <w:rPr>
+                <w:rFonts w:ascii="Arial Narrow" w:hAnsi="Arial Narrow"/>
+                <w:sz w:val="20"/>
+                <w:szCs w:val="20"/>
+              </w:rPr>
+              <w:t xml:space="preserve"> Negeri </w:t>
             </w:r>
             <w:proofErr w:type="spellStart"/>
             <w:r>
@@ -9319,8 +9337,8 @@
       </w:tblPr>
       <w:tblGrid>
         <w:gridCol w:w="551"/>
-        <w:gridCol w:w="5210"/>
-        <w:gridCol w:w="3027"/>
+        <w:gridCol w:w="4127"/>
+        <w:gridCol w:w="4110"/>
       </w:tblGrid>
       <w:tr>
         <w:trPr>
@@ -9355,7 +9373,7 @@
         </w:tc>
         <w:tc>
           <w:tcPr>
-            <w:tcW w:w="5210" w:type="dxa"/>
+            <w:tcW w:w="4127" w:type="dxa"/>
             <w:vAlign w:val="center"/>
           </w:tcPr>
           <w:p>
@@ -9382,7 +9400,7 @@
         </w:tc>
         <w:tc>
           <w:tcPr>
-            <w:tcW w:w="3027" w:type="dxa"/>
+            <w:tcW w:w="4110" w:type="dxa"/>
             <w:vAlign w:val="center"/>
           </w:tcPr>
           <w:p>
@@ -9467,7 +9485,7 @@
         </w:tc>
         <w:tc>
           <w:tcPr>
-            <w:tcW w:w="5210" w:type="dxa"/>
+            <w:tcW w:w="4127" w:type="dxa"/>
           </w:tcPr>
           <w:p>
             <w:pPr>
@@ -9509,7 +9527,7 @@
         </w:tc>
         <w:tc>
           <w:tcPr>
-            <w:tcW w:w="3027" w:type="dxa"/>
+            <w:tcW w:w="4110" w:type="dxa"/>
           </w:tcPr>
           <w:p>
             <w:pPr>
@@ -9614,8 +9632,8 @@
       </w:tblPr>
       <w:tblGrid>
         <w:gridCol w:w="551"/>
-        <w:gridCol w:w="5244"/>
-        <w:gridCol w:w="2993"/>
+        <w:gridCol w:w="4127"/>
+        <w:gridCol w:w="4110"/>
       </w:tblGrid>
       <w:tr>
         <w:trPr>
@@ -9650,7 +9668,7 @@
         </w:tc>
         <w:tc>
           <w:tcPr>
-            <w:tcW w:w="5244" w:type="dxa"/>
+            <w:tcW w:w="4127" w:type="dxa"/>
             <w:vAlign w:val="center"/>
           </w:tcPr>
           <w:p>
@@ -9677,7 +9695,7 @@
         </w:tc>
         <w:tc>
           <w:tcPr>
-            <w:tcW w:w="2993" w:type="dxa"/>
+            <w:tcW w:w="4110" w:type="dxa"/>
             <w:vAlign w:val="center"/>
           </w:tcPr>
           <w:p>
@@ -9762,7 +9780,7 @@
         </w:tc>
         <w:tc>
           <w:tcPr>
-            <w:tcW w:w="5244" w:type="dxa"/>
+            <w:tcW w:w="4127" w:type="dxa"/>
           </w:tcPr>
           <w:p>
             <w:pPr>
@@ -9806,7 +9824,7 @@
         </w:tc>
         <w:tc>
           <w:tcPr>
-            <w:tcW w:w="2993" w:type="dxa"/>
+            <w:tcW w:w="4110" w:type="dxa"/>
           </w:tcPr>
           <w:p>
             <w:pPr>
@@ -9917,8 +9935,8 @@
       </w:tblPr>
       <w:tblGrid>
         <w:gridCol w:w="551"/>
-        <w:gridCol w:w="5336"/>
-        <w:gridCol w:w="3038"/>
+        <w:gridCol w:w="4127"/>
+        <w:gridCol w:w="4247"/>
       </w:tblGrid>
       <w:tr>
         <w:trPr>
@@ -9952,7 +9970,7 @@
         </w:tc>
         <w:tc>
           <w:tcPr>
-            <w:tcW w:w="5336" w:type="dxa"/>
+            <w:tcW w:w="4127" w:type="dxa"/>
           </w:tcPr>
           <w:p>
             <w:pPr>
@@ -9978,7 +9996,7 @@
         </w:tc>
         <w:tc>
           <w:tcPr>
-            <w:tcW w:w="3038" w:type="dxa"/>
+            <w:tcW w:w="4247" w:type="dxa"/>
           </w:tcPr>
           <w:p>
             <w:pPr>
@@ -10046,7 +10064,7 @@
         </w:tc>
         <w:tc>
           <w:tcPr>
-            <w:tcW w:w="5336" w:type="dxa"/>
+            <w:tcW w:w="4127" w:type="dxa"/>
           </w:tcPr>
           <w:p>
             <w:pPr>
@@ -10080,7 +10098,7 @@
         </w:tc>
         <w:tc>
           <w:tcPr>
-            <w:tcW w:w="3038" w:type="dxa"/>
+            <w:tcW w:w="4247" w:type="dxa"/>
           </w:tcPr>
           <w:p>
             <w:pPr>

</xml_diff>